<commit_message>
docs: add revised TinginHB concept note for PSC XI with empirical grounding and probabilistic output
</commit_message>
<xml_diff>
--- a/docs/TinginHB_Methodology_and_Research_Plan.docx
+++ b/docs/TinginHB_Methodology_and_Research_Plan.docx
@@ -1008,6 +1008,80 @@
     </w:p>
     <w:p>
       <w:pPr>
+        <w:spacing w:before="200" w:after="80"/>
+      </w:pPr>
+      <w:r>
+        <w:rPr>
+          <w:b/>
+          <w:color w:val="24769A"/>
+          <w:sz w:val="24"/>
+        </w:rPr>
+        <w:t>2.4 Secondary Physical and Physiological Indicators in Clinical Literature</w:t>
+      </w:r>
+    </w:p>
+    <w:p>
+      <w:pPr>
+        <w:spacing w:before="40" w:after="80"/>
+        <w:jc w:val="both"/>
+      </w:pPr>
+      <w:r>
+        <w:rPr>
+          <w:i w:val="0"/>
+          <w:sz w:val="21"/>
+        </w:rPr>
+        <w:t>In response to the mentor's directive to explore literature-backed secondary physical signs, the clinical evidence base highlights three secondary modalities that complement ocular and ungual inspection:</w:t>
+      </w:r>
+    </w:p>
+    <w:p>
+      <w:pPr>
+        <w:pStyle w:val="ListBullet"/>
+        <w:spacing w:before="20" w:after="20"/>
+      </w:pPr>
+      <w:r>
+        <w:rPr>
+          <w:sz w:val="21"/>
+        </w:rPr>
+        <w:t>Palmar Pallor &amp; Crease Blanching (WHO IMCI, 2013): Blood vessels in the palmar fascia and thenar eminence reflect systemic perfusion. Normal palmar creases retain pigmentation down to Hb ~7.0–8.0 g/dL; blanching of the creases provides an LR+ of 2.8–3.2 for severe anemia (Strobach et al., 1988; Luby et al., 1995).</w:t>
+      </w:r>
+    </w:p>
+    <w:p>
+      <w:pPr>
+        <w:pStyle w:val="ListBullet"/>
+        <w:spacing w:before="20" w:after="20"/>
+      </w:pPr>
+      <w:r>
+        <w:rPr>
+          <w:sz w:val="21"/>
+        </w:rPr>
+        <w:t>Lingual &amp; Oral Mucosal Pallor: Devoid of stratum corneum and melanin, oral mucosa provides direct capillary beds (Sheth et al., 2017; LR+ ≈ 2.1). Reserved as an optional module due to field infection control/hygiene constraints.</w:t>
+      </w:r>
+    </w:p>
+    <w:p>
+      <w:pPr>
+        <w:pStyle w:val="ListBullet"/>
+        <w:spacing w:before="20" w:after="20"/>
+      </w:pPr>
+      <w:r>
+        <w:rPr>
+          <w:sz w:val="21"/>
+        </w:rPr>
+        <w:t>Compensatory Resting Tachycardia via Smartphone Camera PPG: Anemic hypoxia induces compensatory elevation in cardiac output via resting tachycardia (HR &gt; 100 bpm; LR+ ≈ 1.8–2.0) (Strobach et al., 1988; Duke &amp; Abelmann, 1969). A smartphone camera with LED flash acts as a 15-second Photoplethysmography (PPG) pulse sensor without extra hardware (Allen, 2007).</w:t>
+      </w:r>
+    </w:p>
+    <w:p>
+      <w:pPr>
+        <w:pStyle w:val="ListBullet"/>
+        <w:spacing w:before="20" w:after="20"/>
+      </w:pPr>
+      <w:r>
+        <w:rPr>
+          <w:sz w:val="21"/>
+        </w:rPr>
+        <w:t>Clinical Risk Covariates: Structured questionnaire covering pregnancy, lactation, menorrhagia, and dietary history, establishing the Bayesian prior probability P(Anemia) (Kalter et al., 1997).</w:t>
+      </w:r>
+    </w:p>
+    <w:p>
+      <w:pPr>
         <w:spacing w:before="280" w:after="80"/>
       </w:pPr>
       <w:r>
@@ -1482,6 +1556,384 @@
     <w:p/>
     <w:p>
       <w:pPr>
+        <w:spacing w:before="200" w:after="80"/>
+      </w:pPr>
+      <w:r>
+        <w:rPr>
+          <w:b/>
+          <w:color w:val="24769A"/>
+          <w:sz w:val="24"/>
+        </w:rPr>
+        <w:t>3.4 Multi-Indicator Weighting &amp; Integration Architecture</w:t>
+      </w:r>
+    </w:p>
+    <w:p>
+      <w:pPr>
+        <w:spacing w:before="40" w:after="80"/>
+        <w:jc w:val="both"/>
+      </w:pPr>
+      <w:r>
+        <w:rPr>
+          <w:i w:val="0"/>
+          <w:sz w:val="21"/>
+        </w:rPr>
+        <w:t>To integrate secondary physical and physiological indicators with the primary optical channels without introducing noise, TinginHB employs a Two-Tiered Hierarchical Bayesian Integration Model backed by clinical likelihood ratios (Strobach et al., 1988; Kalter et al., 1997):</w:t>
+      </w:r>
+    </w:p>
+    <w:p>
+      <w:pPr>
+        <w:spacing w:before="80" w:after="80"/>
+        <w:ind w:left="567"/>
+        <w:shd w:val="clear" w:color="auto" w:fill="F0F0F0"/>
+      </w:pPr>
+      <w:r>
+        <w:rPr>
+          <w:rFonts w:ascii="Courier New" w:hAnsi="Courier New"/>
+          <w:sz w:val="18"/>
+        </w:rPr>
+        <w:t>ln(Odds_post) = ln(Odds_prior) + w_conj*ln(LR_conj) + w_nail*ln(LR_nail) + w_palm*ln(LR_palm) + w_tachy*ln(LR_tachy)</w:t>
+      </w:r>
+    </w:p>
+    <w:tbl>
+      <w:tblPr>
+        <w:tblStyle w:val="TableGrid"/>
+        <w:tblW w:type="auto" w:w="0"/>
+        <w:jc w:val="center"/>
+        <w:tblLook w:firstColumn="1" w:firstRow="1" w:lastColumn="0" w:lastRow="0" w:noHBand="0" w:noVBand="1" w:val="04A0"/>
+      </w:tblPr>
+      <w:tblGrid>
+        <w:gridCol w:w="2280"/>
+        <w:gridCol w:w="2280"/>
+        <w:gridCol w:w="2280"/>
+        <w:gridCol w:w="2280"/>
+      </w:tblGrid>
+      <w:tr>
+        <w:tc>
+          <w:tcPr>
+            <w:tcW w:type="dxa" w:w="2551"/>
+            <w:shd w:val="clear" w:color="auto" w:fill="1A5676"/>
+          </w:tcPr>
+          <w:p>
+            <w:pPr>
+              <w:jc w:val="center"/>
+            </w:pPr>
+            <w:r>
+              <w:rPr>
+                <w:b/>
+                <w:color w:val="FFFFFF"/>
+                <w:sz w:val="19"/>
+              </w:rPr>
+              <w:t>Modality / Indicator</w:t>
+            </w:r>
+          </w:p>
+        </w:tc>
+        <w:tc>
+          <w:tcPr>
+            <w:tcW w:type="dxa" w:w="3118"/>
+            <w:shd w:val="clear" w:color="auto" w:fill="1A5676"/>
+          </w:tcPr>
+          <w:p>
+            <w:pPr>
+              <w:jc w:val="center"/>
+            </w:pPr>
+            <w:r>
+              <w:rPr>
+                <w:b/>
+                <w:color w:val="FFFFFF"/>
+                <w:sz w:val="19"/>
+              </w:rPr>
+              <w:t>Diagnostic Metric</w:t>
+            </w:r>
+          </w:p>
+        </w:tc>
+        <w:tc>
+          <w:tcPr>
+            <w:tcW w:type="dxa" w:w="1417"/>
+            <w:shd w:val="clear" w:color="auto" w:fill="1A5676"/>
+          </w:tcPr>
+          <w:p>
+            <w:pPr>
+              <w:jc w:val="center"/>
+            </w:pPr>
+            <w:r>
+              <w:rPr>
+                <w:b/>
+                <w:color w:val="FFFFFF"/>
+                <w:sz w:val="19"/>
+              </w:rPr>
+              <w:t>Weight (w_i)</w:t>
+            </w:r>
+          </w:p>
+        </w:tc>
+        <w:tc>
+          <w:tcPr>
+            <w:tcW w:type="dxa" w:w="3685"/>
+            <w:shd w:val="clear" w:color="auto" w:fill="1A5676"/>
+          </w:tcPr>
+          <w:p>
+            <w:pPr>
+              <w:jc w:val="center"/>
+            </w:pPr>
+            <w:r>
+              <w:rPr>
+                <w:b/>
+                <w:color w:val="FFFFFF"/>
+                <w:sz w:val="19"/>
+              </w:rPr>
+              <w:t>Literature Grounding</w:t>
+            </w:r>
+          </w:p>
+        </w:tc>
+      </w:tr>
+      <w:tr>
+        <w:tc>
+          <w:tcPr>
+            <w:tcW w:type="dxa" w:w="2551"/>
+            <w:shd w:val="clear" w:color="auto" w:fill="FFFFFF"/>
+          </w:tcPr>
+          <w:p>
+            <w:r>
+              <w:rPr>
+                <w:sz w:val="19"/>
+              </w:rPr>
+              <w:t>Palpebral Conjunctiva</w:t>
+            </w:r>
+          </w:p>
+        </w:tc>
+        <w:tc>
+          <w:tcPr>
+            <w:tcW w:type="dxa" w:w="3118"/>
+            <w:shd w:val="clear" w:color="auto" w:fill="FFFFFF"/>
+          </w:tcPr>
+          <w:p>
+            <w:r>
+              <w:rPr>
+                <w:sz w:val="19"/>
+              </w:rPr>
+              <w:t>LR+ ≈ 4.4 (Sens: 85%, Spec: 81%)</w:t>
+            </w:r>
+          </w:p>
+        </w:tc>
+        <w:tc>
+          <w:tcPr>
+            <w:tcW w:type="dxa" w:w="1417"/>
+            <w:shd w:val="clear" w:color="auto" w:fill="FFFFFF"/>
+          </w:tcPr>
+          <w:p>
+            <w:r>
+              <w:rPr>
+                <w:sz w:val="19"/>
+              </w:rPr>
+              <w:t>w = 1.0</w:t>
+            </w:r>
+          </w:p>
+        </w:tc>
+        <w:tc>
+          <w:tcPr>
+            <w:tcW w:type="dxa" w:w="3685"/>
+            <w:shd w:val="clear" w:color="auto" w:fill="FFFFFF"/>
+          </w:tcPr>
+          <w:p>
+            <w:r>
+              <w:rPr>
+                <w:sz w:val="19"/>
+              </w:rPr>
+              <w:t>Primary optical driver; zero melanin (Strobach 1988; Kim 2020)</w:t>
+            </w:r>
+          </w:p>
+        </w:tc>
+      </w:tr>
+      <w:tr>
+        <w:tc>
+          <w:tcPr>
+            <w:tcW w:type="dxa" w:w="2551"/>
+            <w:shd w:val="clear" w:color="auto" w:fill="E8F4F8"/>
+          </w:tcPr>
+          <w:p>
+            <w:r>
+              <w:rPr>
+                <w:sz w:val="19"/>
+              </w:rPr>
+              <w:t>Subungual Nail Bed</w:t>
+            </w:r>
+          </w:p>
+        </w:tc>
+        <w:tc>
+          <w:tcPr>
+            <w:tcW w:type="dxa" w:w="3118"/>
+            <w:shd w:val="clear" w:color="auto" w:fill="E8F4F8"/>
+          </w:tcPr>
+          <w:p>
+            <w:r>
+              <w:rPr>
+                <w:sz w:val="19"/>
+              </w:rPr>
+              <w:t>LR+ ≈ 2.2 (Sens: 78%, Spec: 65%)</w:t>
+            </w:r>
+          </w:p>
+        </w:tc>
+        <w:tc>
+          <w:tcPr>
+            <w:tcW w:type="dxa" w:w="1417"/>
+            <w:shd w:val="clear" w:color="auto" w:fill="E8F4F8"/>
+          </w:tcPr>
+          <w:p>
+            <w:r>
+              <w:rPr>
+                <w:sz w:val="19"/>
+              </w:rPr>
+              <w:t>w = 0.8</w:t>
+            </w:r>
+          </w:p>
+        </w:tc>
+        <w:tc>
+          <w:tcPr>
+            <w:tcW w:type="dxa" w:w="3685"/>
+            <w:shd w:val="clear" w:color="auto" w:fill="E8F4F8"/>
+          </w:tcPr>
+          <w:p>
+            <w:r>
+              <w:rPr>
+                <w:sz w:val="19"/>
+              </w:rPr>
+              <w:t>Primary co-driver; CR-normalized (Mannino 2018)</w:t>
+            </w:r>
+          </w:p>
+        </w:tc>
+      </w:tr>
+      <w:tr>
+        <w:tc>
+          <w:tcPr>
+            <w:tcW w:type="dxa" w:w="2551"/>
+            <w:shd w:val="clear" w:color="auto" w:fill="FFFFFF"/>
+          </w:tcPr>
+          <w:p>
+            <w:r>
+              <w:rPr>
+                <w:sz w:val="19"/>
+              </w:rPr>
+              <w:t>Palmar Creases (Gated)</w:t>
+            </w:r>
+          </w:p>
+        </w:tc>
+        <w:tc>
+          <w:tcPr>
+            <w:tcW w:type="dxa" w:w="3118"/>
+            <w:shd w:val="clear" w:color="auto" w:fill="FFFFFF"/>
+          </w:tcPr>
+          <w:p>
+            <w:r>
+              <w:rPr>
+                <w:sz w:val="19"/>
+              </w:rPr>
+              <w:t>LR+ ≈ 2.9 (blanched creases)</w:t>
+            </w:r>
+          </w:p>
+        </w:tc>
+        <w:tc>
+          <w:tcPr>
+            <w:tcW w:type="dxa" w:w="1417"/>
+            <w:shd w:val="clear" w:color="auto" w:fill="FFFFFF"/>
+          </w:tcPr>
+          <w:p>
+            <w:r>
+              <w:rPr>
+                <w:sz w:val="19"/>
+              </w:rPr>
+              <w:t>w = 0.5</w:t>
+            </w:r>
+          </w:p>
+        </w:tc>
+        <w:tc>
+          <w:tcPr>
+            <w:tcW w:type="dxa" w:w="3685"/>
+            <w:shd w:val="clear" w:color="auto" w:fill="FFFFFF"/>
+          </w:tcPr>
+          <w:p>
+            <w:r>
+              <w:rPr>
+                <w:sz w:val="19"/>
+              </w:rPr>
+              <w:t>Secondary corroborator upon ambiguity (Kalter 1997; Luby 1995)</w:t>
+            </w:r>
+          </w:p>
+        </w:tc>
+      </w:tr>
+      <w:tr>
+        <w:tc>
+          <w:tcPr>
+            <w:tcW w:type="dxa" w:w="2551"/>
+            <w:shd w:val="clear" w:color="auto" w:fill="E8F4F8"/>
+          </w:tcPr>
+          <w:p>
+            <w:r>
+              <w:rPr>
+                <w:sz w:val="19"/>
+              </w:rPr>
+              <w:t>Resting Tachycardia</w:t>
+            </w:r>
+          </w:p>
+        </w:tc>
+        <w:tc>
+          <w:tcPr>
+            <w:tcW w:type="dxa" w:w="3118"/>
+            <w:shd w:val="clear" w:color="auto" w:fill="E8F4F8"/>
+          </w:tcPr>
+          <w:p>
+            <w:r>
+              <w:rPr>
+                <w:sz w:val="19"/>
+              </w:rPr>
+              <w:t>LR+ ≈ 1.9 (HR &gt; 100 bpm, resting)</w:t>
+            </w:r>
+          </w:p>
+        </w:tc>
+        <w:tc>
+          <w:tcPr>
+            <w:tcW w:type="dxa" w:w="1417"/>
+            <w:shd w:val="clear" w:color="auto" w:fill="E8F4F8"/>
+          </w:tcPr>
+          <w:p>
+            <w:r>
+              <w:rPr>
+                <w:sz w:val="19"/>
+              </w:rPr>
+              <w:t>w = 0.4</w:t>
+            </w:r>
+          </w:p>
+        </w:tc>
+        <w:tc>
+          <w:tcPr>
+            <w:tcW w:type="dxa" w:w="3685"/>
+            <w:shd w:val="clear" w:color="auto" w:fill="E8F4F8"/>
+          </w:tcPr>
+          <w:p>
+            <w:r>
+              <w:rPr>
+                <w:sz w:val="19"/>
+              </w:rPr>
+              <w:t>Compensatory cardiac output via 15s camera PPG (Allen 2007)</w:t>
+            </w:r>
+          </w:p>
+        </w:tc>
+      </w:tr>
+    </w:tbl>
+    <w:p/>
+    <w:p>
+      <w:pPr>
+        <w:spacing w:before="40" w:after="80"/>
+        <w:jc w:val="both"/>
+      </w:pPr>
+      <w:r>
+        <w:rPr>
+          <w:i w:val="0"/>
+          <w:sz w:val="21"/>
+        </w:rPr>
+        <w:t>Tier 2 Gating Rule: Secondary checks (Palmar Crease scan, 15s camera PPG) are only activated if primary uncertainty σ_prim &gt; 1.2 g/dL or if primary discrepancy |ŷ_conj - ŷ_nail| &gt; 2.0 g/dL. This preserves fast BHW workflow while providing clinical resilience.</w:t>
+      </w:r>
+    </w:p>
+    <w:p>
+      <w:pPr>
         <w:spacing w:before="280" w:after="80"/>
       </w:pPr>
       <w:r>
@@ -1517,27 +1969,43 @@
           <w:rFonts w:ascii="Courier New" w:hAnsi="Courier New"/>
           <w:sz w:val="18"/>
         </w:rPr>
-        <w:t>[Camera Input]</w:t>
+        <w:t>[Camera &amp; Sensor Inputs]</w:t>
         <w:br/>
-        <w:t xml:space="preserve">  ├── Conjunctiva ──► YOLOv8n-seg ROI ──► MobileNetV3-S + Radiomics ──► ŷ_conj ± σ_conj</w:t>
+        <w:t xml:space="preserve">  ├── TIER 1: PRIMARY SITES</w:t>
         <w:br/>
-        <w:t xml:space="preserve">  └── Nail Bed ─────► YOLOv8n-seg ROI ──► MobileNetV3-S + CR Norm  ──► ŷ_nail ± σ_nail</w:t>
+        <w:t xml:space="preserve">  │    ├── Conjunctiva Image ──► YOLOv8n-seg ROI ──► MobileNetV3-S + Radiomics ──► ŷ_conj ± σ_conj</w:t>
         <w:br/>
-        <w:t xml:space="preserve">                                                          │</w:t>
+        <w:t xml:space="preserve">  │    └── Nail Bed Image ─────► YOLOv8n-seg ROI ──► MobileNetV3-S + CR Norm  ──► ŷ_nail ± σ_nail</w:t>
         <w:br/>
-        <w:t xml:space="preserve">                               [Inverse-Variance Fusion + Discrepancy Flag]</w:t>
+        <w:t xml:space="preserve">  │                                                                                  │</w:t>
         <w:br/>
-        <w:t xml:space="preserve">                                                          │</w:t>
+        <w:t xml:space="preserve">  │                                                [Inverse-Variance Fusion &amp; Gating Rule]</w:t>
         <w:br/>
-        <w:t xml:space="preserve">                               [Platt Scaling Calibration]</w:t>
+        <w:t xml:space="preserve">  │                                                                                  │</w:t>
         <w:br/>
-        <w:t xml:space="preserve">                                                          │</w:t>
+        <w:t xml:space="preserve">  └── TIER 2: GATED SECONDARY SIGNS (Activated if σ &gt; 1.2 or Δ &gt; 2.0)                │</w:t>
         <w:br/>
-        <w:t xml:space="preserve">                               P(Moderate-Severe Anemia | image)</w:t>
+        <w:t xml:space="preserve">       ├── Palmar Crease Image ──► YOLOv8n-seg ROI ──► MobileNetV3-S Feature ────────┤</w:t>
         <w:br/>
-        <w:t xml:space="preserve">                                                          │</w:t>
+        <w:t xml:space="preserve">       ├── 15s Finger Flash PPG ─► [Peak Detection Algorithm] ──► Resting HR ────────┤</w:t>
         <w:br/>
-        <w:t xml:space="preserve">                               [BHW-facing Triage Label]</w:t>
+        <w:t xml:space="preserve">       └── BHW Risk Checklist ──► [Categorical Risk Multiplier] ─────────────────────┤</w:t>
+        <w:br/>
+        <w:t xml:space="preserve">                                                                                      ▼</w:t>
+        <w:br/>
+        <w:t xml:space="preserve">                                                               [Bayesian Log-Odds Integration]</w:t>
+        <w:br/>
+        <w:t xml:space="preserve">                                                                                      │</w:t>
+        <w:br/>
+        <w:t xml:space="preserve">                                                                 [Platt Scaling Calibration]</w:t>
+        <w:br/>
+        <w:t xml:space="preserve">                                                                                      │</w:t>
+        <w:br/>
+        <w:t xml:space="preserve">                                                                     P(Moderate-Severe Anemia)</w:t>
+        <w:br/>
+        <w:t xml:space="preserve">                                                                                      │</w:t>
+        <w:br/>
+        <w:t xml:space="preserve">                                                                      [BHW-Facing Triage Label]</w:t>
       </w:r>
     </w:p>
     <w:p>
@@ -5175,6 +5643,66 @@
         <w:t>19. Stolz, W., et al. (1993). Color Atlas of Dermatology (Fitzpatrick phototype reference). Blackwell.</w:t>
       </w:r>
     </w:p>
+    <w:p>
+      <w:pPr>
+        <w:spacing w:before="20" w:after="40"/>
+        <w:ind w:left="340" w:hanging="340"/>
+      </w:pPr>
+      <w:r>
+        <w:rPr>
+          <w:sz w:val="19"/>
+        </w:rPr>
+        <w:t>20. Strobach, R. S., et al. (1988). The value of the physical examination in diagnosing anemia. JAMA, 259(11), 1682–1685.</w:t>
+      </w:r>
+    </w:p>
+    <w:p>
+      <w:pPr>
+        <w:spacing w:before="20" w:after="40"/>
+        <w:ind w:left="340" w:hanging="340"/>
+      </w:pPr>
+      <w:r>
+        <w:rPr>
+          <w:sz w:val="19"/>
+        </w:rPr>
+        <w:t>21. Luby, S. P., et al. (1995). Using clinical signs to diagnose anaemia in African children. Bulletin of the World Health Organization, 73(4), 477–482.</w:t>
+      </w:r>
+    </w:p>
+    <w:p>
+      <w:pPr>
+        <w:spacing w:before="20" w:after="40"/>
+        <w:ind w:left="340" w:hanging="340"/>
+      </w:pPr>
+      <w:r>
+        <w:rPr>
+          <w:sz w:val="19"/>
+        </w:rPr>
+        <w:t>22. Sheth, P. B., et al. (2017). Non-invasive anemia detection using smartphone-based tongue colorimetry. IEEE JBHI.</w:t>
+      </w:r>
+    </w:p>
+    <w:p>
+      <w:pPr>
+        <w:spacing w:before="20" w:after="40"/>
+        <w:ind w:left="340" w:hanging="340"/>
+      </w:pPr>
+      <w:r>
+        <w:rPr>
+          <w:sz w:val="19"/>
+        </w:rPr>
+        <w:t>23. Allen, J. (2007). Photoplethysmography and its application in clinical physiological measurement. Physiological Measurement, 28(3), R1–R39.</w:t>
+      </w:r>
+    </w:p>
+    <w:p>
+      <w:pPr>
+        <w:spacing w:before="20" w:after="40"/>
+        <w:ind w:left="340" w:hanging="340"/>
+      </w:pPr>
+      <w:r>
+        <w:rPr>
+          <w:sz w:val="19"/>
+        </w:rPr>
+        <w:t>24. Duke, M., &amp; Abelmann, W. H. (1969). The hemodynamic response to chronic anemia. Circulation, 39(4), 503–515.</w:t>
+      </w:r>
+    </w:p>
     <w:p/>
     <w:p>
       <w:pPr>

</xml_diff>